<commit_message>
Fix Baseline v2 layout: English cover, bigger diagram text, figure citations
- Cover page description was left in Spanish; translated to English
- Module flow diagram was illegible when embedded at portrait width; moved
  it to its own landscape page and enlarged all labels (title, chips,
  arrow annotations) for projector visibility
- Architecture diagram text enlarged the same way; removed the in-image
  caption duplicated by the Word figure caption below it
- Added citation sentences in the body text pointing readers to each figure
</commit_message>
<xml_diff>
--- a/Baseline_Documento/Baseline_SMMyE_V2.docx
+++ b/Baseline_Documento/Baseline_SMMyE_V2.docx
@@ -142,7 +142,7 @@
           <w:sz w:val="22"/>
           <w:szCs w:val="22"/>
         </w:rPr>
-        <w:t xml:space="preserve">Descripción breve</w:t>
+        <w:t xml:space="preserve">Brief description</w:t>
       </w:r>
     </w:p>
     <w:p>
@@ -258,8 +258,18 @@
           <w:sz w:val="22"/>
           <w:szCs w:val="22"/>
         </w:rPr>
-        <w:t xml:space="preserve">Before detailing the individual requirements, this section shows how the system's five modules communicate with one another, and how a regular user and an administrator each move through them. Both actor types authenticate first; from there, a regular (public) user goes directly to real-time monitoring and can consult EcoFlow, while an administrator additionally passes through the Users &amp; Access and Catalog modules to configure the platform before reaching the same monitoring and AI assistant modules. The dashed vertical lines mark the modules both flows share.</w:t>
-      </w:r>
+        <w:t xml:space="preserve">Before detailing the individual requirements, this section shows how the system's five modules communicate with one another, and how a regular user and an administrator each move through them. Both actor types authenticate first; from there, a regular (public) user goes directly to real-time monitoring and can consult EcoFlow, while an administrator additionally passes through the Users &amp; Access and Catalog modules to configure the platform before reaching the same monitoring and AI assistant modules. The dashed vertical lines mark the modules both flows share. Figure 2.1, on the following page, presents this comparison at full size for legibility.</w:t>
+      </w:r>
+    </w:p>
+    <w:p>
+      <w:pPr>
+        <w:sectPr>
+          <w:pgSz w:w="11906" w:h="16838" w:orient="portrait"/>
+          <w:pgMar w:top="1440" w:right="1440" w:bottom="1440" w:left="1440" w:header="708" w:footer="708" w:gutter="0"/>
+          <w:pgNumType/>
+          <w:docGrid w:linePitch="360"/>
+        </w:sectPr>
+      </w:pPr>
     </w:p>
     <w:p>
       <w:pPr>
@@ -269,7 +279,7 @@
       <w:r>
         <w:drawing>
           <wp:inline distT="0" distB="0" distL="0" distR="0">
-            <wp:extent cx="6286500" cy="2800350"/>
+            <wp:extent cx="8763000" cy="3790950"/>
             <wp:effectExtent t="0" r="0" b="0" l="0"/>
             <wp:docPr id="1" name="" descr="" title=""/>
             <wp:cNvGraphicFramePr>
@@ -294,7 +304,7 @@
                   <pic:spPr bwMode="auto">
                     <a:xfrm>
                       <a:off x="0" y="0"/>
-                      <a:ext cx="6286500" cy="2800350"/>
+                      <a:ext cx="8763000" cy="3790950"/>
                     </a:xfrm>
                     <a:prstGeom prst="rect">
                       <a:avLst/>
@@ -317,11 +327,21 @@
           <w:i/>
           <w:iCs/>
           <w:color w:val="5B6770"/>
-          <w:sz w:val="18"/>
-          <w:szCs w:val="18"/>
+          <w:sz w:val="20"/>
+          <w:szCs w:val="20"/>
         </w:rPr>
         <w:t xml:space="preserve">Fig. 2.1. Module communication and user flows (regular user vs. administrator)</w:t>
       </w:r>
+    </w:p>
+    <w:p>
+      <w:pPr>
+        <w:sectPr>
+          <w:pgSz w:w="15840" w:h="12240" w:orient="landscape"/>
+          <w:pgMar w:top="863" w:right="863" w:bottom="863" w:left="863" w:header="708" w:footer="708" w:gutter="0"/>
+          <w:pgNumType/>
+          <w:docGrid w:linePitch="360"/>
+        </w:sectPr>
+      </w:pPr>
     </w:p>
     <w:p>
       <w:pPr>
@@ -938,13 +958,25 @@
     </w:p>
     <w:p>
       <w:pPr>
+        <w:spacing w:after="160"/>
+      </w:pPr>
+      <w:r>
+        <w:rPr>
+          <w:sz w:val="22"/>
+          <w:szCs w:val="22"/>
+        </w:rPr>
+        <w:t xml:space="preserve">Figure 1.1 below shows the system's five layers, from IoT data acquisition through the REST API and database up to the presentation layer and the conversational AI layer that powers EcoFlow.</w:t>
+      </w:r>
+    </w:p>
+    <w:p>
+      <w:pPr>
         <w:spacing w:after="60" w:before="100"/>
         <w:jc w:val="center"/>
       </w:pPr>
       <w:r>
         <w:drawing>
           <wp:inline distT="0" distB="0" distL="0" distR="0">
-            <wp:extent cx="6477000" cy="3609975"/>
+            <wp:extent cx="5572125" cy="2343150"/>
             <wp:effectExtent t="0" r="0" b="0" l="0"/>
             <wp:docPr id="1" name="" descr="" title=""/>
             <wp:cNvGraphicFramePr>
@@ -969,7 +1001,7 @@
                   <pic:spPr bwMode="auto">
                     <a:xfrm>
                       <a:off x="0" y="0"/>
-                      <a:ext cx="6477000" cy="3609975"/>
+                      <a:ext cx="5572125" cy="2343150"/>
                     </a:xfrm>
                     <a:prstGeom prst="rect">
                       <a:avLst/>
@@ -992,8 +1024,8 @@
           <w:i/>
           <w:iCs/>
           <w:color w:val="5B6770"/>
-          <w:sz w:val="18"/>
-          <w:szCs w:val="18"/>
+          <w:sz w:val="20"/>
+          <w:szCs w:val="20"/>
         </w:rPr>
         <w:t xml:space="preserve">Fig. 1.1. System Architecture</w:t>
       </w:r>

</xml_diff>